<commit_message>
docs(maintain): EXC-1 triage T-08a/b/c/d as cross-app refs in DOCX
T-08a (MAINTAIN-DEPART) / T-08b (MAINTAIN-ARRIVE) /
T-08c (MAINTAIN-CHECKLIST) / T-08d (MAINTAIN-COMPLETE)
— ทั้ง 4 sub-states เป็น WeeeT screens (port 3003, app=WeeeT)
— Decision (a): คง rows ทุก row แต่เพิ่ม col-8 หมายเหตุ:
  "cross-app ref → WeeeT เจ้าของ · Maintain ไม่ build"
— 10 occurrences across 11 tables updated
— docx-not-code gaps remaining: 0
— ไม่มี code change (⛔ ห้าม build T-08* ใน Maintain)

Co-Authored-By: Claude Sonnet 4.6 <noreply@anthropic.com>
</commit_message>
<xml_diff>
--- a/docs/Maintain_Module.docx
+++ b/docs/Maintain_Module.docx
@@ -2930,6 +2930,9 @@
               </w:rPr>
               <w:t>กด depart → location track</w:t>
             </w:r>
+            <w:r>
+              <w:t xml:space="preserve"> · cross-app ref → WeeeT เจ้าของ · Maintain ไม่ build</w:t>
+            </w:r>
           </w:p>
         </w:tc>
         <w:tc>
@@ -3114,6 +3117,9 @@
               </w:rPr>
               <w:t>อัพโหลดรูปถึงที่</w:t>
             </w:r>
+            <w:r>
+              <w:t xml:space="preserve"> · cross-app ref → WeeeT เจ้าของ · Maintain ไม่ build</w:t>
+            </w:r>
           </w:p>
         </w:tc>
         <w:tc>
@@ -3475,6 +3481,9 @@
               </w:rPr>
               <w:t>checklist รายการล้าง</w:t>
             </w:r>
+            <w:r>
+              <w:t xml:space="preserve"> · cross-app ref → WeeeT เจ้าของ · Maintain ไม่ build</w:t>
+            </w:r>
           </w:p>
         </w:tc>
         <w:tc>
@@ -3651,6 +3660,9 @@
                 <w:sz w:val="15"/>
               </w:rPr>
               <w:t>complete + อัพโหลดรูปหลังล้าง</w:t>
+            </w:r>
+            <w:r>
+              <w:t xml:space="preserve"> · cross-app ref → WeeeT เจ้าของ · Maintain ไม่ build</w:t>
             </w:r>
           </w:p>
         </w:tc>
@@ -9646,6 +9658,9 @@
               </w:rPr>
               <w:t>checklist รวม repair items</w:t>
             </w:r>
+            <w:r>
+              <w:t xml:space="preserve"> · cross-app ref → WeeeT เจ้าของ · Maintain ไม่ build</w:t>
+            </w:r>
           </w:p>
         </w:tc>
         <w:tc>
@@ -11166,6 +11181,9 @@
               </w:rPr>
               <w:t>หลังอัพ → "รอลูกค้า" stage</w:t>
             </w:r>
+            <w:r>
+              <w:t xml:space="preserve"> · cross-app ref → WeeeT เจ้าของ · Maintain ไม่ build</w:t>
+            </w:r>
           </w:p>
         </w:tc>
         <w:tc>
@@ -15955,6 +15973,9 @@
                 <w:sz w:val="15"/>
               </w:rPr>
             </w:r>
+            <w:r>
+              <w:t>cross-app ref → WeeeT เจ้าของ · Maintain ไม่ build</w:t>
+            </w:r>
           </w:p>
         </w:tc>
         <w:tc>
@@ -16135,6 +16156,9 @@
                 <w:sz w:val="15"/>
               </w:rPr>
             </w:r>
+            <w:r>
+              <w:t>cross-app ref → WeeeT เจ้าของ · Maintain ไม่ build</w:t>
+            </w:r>
           </w:p>
         </w:tc>
         <w:tc>
@@ -16308,6 +16332,9 @@
                 <w:sz w:val="15"/>
               </w:rPr>
             </w:r>
+            <w:r>
+              <w:t>cross-app ref → WeeeT เจ้าของ · Maintain ไม่ build</w:t>
+            </w:r>
           </w:p>
         </w:tc>
         <w:tc>
@@ -16487,6 +16514,9 @@
                 <w:i w:val="0"/>
                 <w:sz w:val="15"/>
               </w:rPr>
+            </w:r>
+            <w:r>
+              <w:t>cross-app ref → WeeeT เจ้าของ · Maintain ไม่ build</w:t>
             </w:r>
           </w:p>
         </w:tc>

</xml_diff>

<commit_message>
docs(maintain): P4-T5 delete R-12b/R-12c — Advisor Ruling R1
R-12b (MAINTAIN-QUEUE-OFFER) + R-12c (MAINTAIN-OFFER-SUCCESS)
= WeeeR-owned sub-screens ที่ Ruling R1 ตัดสิน "ไม่ใช่จอจริง" (rule-c)
→ ห้ามปรากฏในเอกสารแม้เป็น note (กันหลอกผู้ตรวจ)

Changes:
- ลบ R-12b PRIMARY ROW (Table 0 Row 8) ออกจาก DOCX
- ลบ R-12c PRIMARY ROW (Table 0 Row 9) ออกจาก DOCX
- ลบ R-12b + R-12c ออกจาก summary table (Table 10 rows 2-3)
- redirect nav R-12 col-4 จาก R-12b → R-12 (base screen)
- grep R-12b/R-12c = 0 occurrences · 11 tables · 88 data rows

Co-Authored-By: Claude Sonnet 4.6 <noreply@anthropic.com>
</commit_message>
<xml_diff>
--- a/docs/Maintain_Module.docx
+++ b/docs/Maintain_Module.docx
@@ -1427,7 +1427,7 @@
                 <w:i w:val="0"/>
                 <w:sz w:val="15"/>
               </w:rPr>
-              <w:t>R-12b</w:t>
+              <w:t>R-12</w:t>
             </w:r>
           </w:p>
         </w:tc>
@@ -1504,367 +1504,6 @@
                 <w:sz w:val="15"/>
               </w:rPr>
               <w:t>http://localhost:3002/maintain/queue</w:t>
-            </w:r>
-          </w:p>
-        </w:tc>
-      </w:tr>
-      <w:tr>
-        <w:trPr>
-          <w:trHeight w:val="340" w:hRule="atLeast"/>
-        </w:trPr>
-        <w:tc>
-          <w:tcPr>
-            <w:tcW w:type="dxa" w:w="1020"/>
-            <w:vAlign w:val="center"/>
-            <w:shd w:val="clear" w:color="auto" w:fill="F8FAFF"/>
-          </w:tcPr>
-          <w:p>
-            <w:pPr>
-              <w:jc w:val="left"/>
-            </w:pPr>
-            <w:r>
-              <w:rPr>
-                <w:b w:val="0"/>
-                <w:i w:val="0"/>
-                <w:sz w:val="15"/>
-              </w:rPr>
-              <w:t>R-12b</w:t>
-            </w:r>
-          </w:p>
-        </w:tc>
-        <w:tc>
-          <w:tcPr>
-            <w:tcW w:type="dxa" w:w="1814"/>
-            <w:vAlign w:val="center"/>
-            <w:shd w:val="clear" w:color="auto" w:fill="F8FAFF"/>
-          </w:tcPr>
-          <w:p>
-            <w:pPr>
-              <w:jc w:val="left"/>
-            </w:pPr>
-            <w:r>
-              <w:rPr>
-                <w:b w:val="0"/>
-                <w:i w:val="0"/>
-                <w:sz w:val="15"/>
-              </w:rPr>
-              <w:t>🆕 MAINTAIN-QUEUE-OFFER</w:t>
-            </w:r>
-          </w:p>
-        </w:tc>
-        <w:tc>
-          <w:tcPr>
-            <w:tcW w:type="dxa" w:w="1361"/>
-            <w:vAlign w:val="center"/>
-            <w:shd w:val="clear" w:color="auto" w:fill="F8FAFF"/>
-          </w:tcPr>
-          <w:p>
-            <w:pPr>
-              <w:jc w:val="left"/>
-            </w:pPr>
-            <w:r>
-              <w:rPr>
-                <w:b w:val="0"/>
-                <w:i w:val="0"/>
-                <w:sz w:val="15"/>
-              </w:rPr>
-              <w:t>R-12</w:t>
-            </w:r>
-          </w:p>
-        </w:tc>
-        <w:tc>
-          <w:tcPr>
-            <w:tcW w:type="dxa" w:w="1701"/>
-            <w:vAlign w:val="center"/>
-            <w:shd w:val="clear" w:color="auto" w:fill="F8FAFF"/>
-          </w:tcPr>
-          <w:p>
-            <w:pPr>
-              <w:jc w:val="left"/>
-            </w:pPr>
-            <w:r>
-              <w:rPr>
-                <w:b w:val="0"/>
-                <w:i w:val="0"/>
-                <w:sz w:val="15"/>
-              </w:rPr>
-              <w:t>M1: ร้านยื่นข้อเสนอ</w:t>
-            </w:r>
-          </w:p>
-        </w:tc>
-        <w:tc>
-          <w:tcPr>
-            <w:tcW w:type="dxa" w:w="1361"/>
-            <w:vAlign w:val="center"/>
-            <w:shd w:val="clear" w:color="auto" w:fill="F8FAFF"/>
-          </w:tcPr>
-          <w:p>
-            <w:pPr>
-              <w:jc w:val="left"/>
-            </w:pPr>
-            <w:r>
-              <w:rPr>
-                <w:b w:val="0"/>
-                <w:i w:val="0"/>
-                <w:sz w:val="15"/>
-              </w:rPr>
-              <w:t>R-12c</w:t>
-            </w:r>
-          </w:p>
-        </w:tc>
-        <w:tc>
-          <w:tcPr>
-            <w:tcW w:type="dxa" w:w="1134"/>
-            <w:vAlign w:val="center"/>
-            <w:shd w:val="clear" w:color="auto" w:fill="F8FAFF"/>
-          </w:tcPr>
-          <w:p>
-            <w:pPr>
-              <w:jc w:val="left"/>
-            </w:pPr>
-            <w:r>
-              <w:rPr>
-                <w:b w:val="0"/>
-                <w:i w:val="0"/>
-                <w:sz w:val="15"/>
-              </w:rPr>
-              <w:t>WeeeR</w:t>
-            </w:r>
-          </w:p>
-        </w:tc>
-        <w:tc>
-          <w:tcPr>
-            <w:tcW w:type="dxa" w:w="850"/>
-            <w:vAlign w:val="center"/>
-            <w:shd w:val="clear" w:color="auto" w:fill="F8FAFF"/>
-          </w:tcPr>
-          <w:p>
-            <w:pPr>
-              <w:jc w:val="left"/>
-            </w:pPr>
-            <w:r>
-              <w:rPr>
-                <w:b w:val="0"/>
-                <w:i w:val="0"/>
-                <w:sz w:val="15"/>
-              </w:rPr>
-              <w:t>M1</w:t>
-            </w:r>
-          </w:p>
-        </w:tc>
-        <w:tc>
-          <w:tcPr>
-            <w:tcW w:type="dxa" w:w="1984"/>
-            <w:vAlign w:val="center"/>
-            <w:shd w:val="clear" w:color="auto" w:fill="F8FAFF"/>
-          </w:tcPr>
-          <w:p>
-            <w:pPr>
-              <w:jc w:val="left"/>
-            </w:pPr>
-            <w:r>
-              <w:rPr>
-                <w:b w:val="0"/>
-                <w:i w:val="0"/>
-                <w:sz w:val="15"/>
-              </w:rPr>
-              <w:t>กรอก offer: ราคา/ค่าเดินทาง/เงื่อนไข</w:t>
-            </w:r>
-          </w:p>
-        </w:tc>
-        <w:tc>
-          <w:tcPr>
-            <w:tcW w:type="dxa" w:w="2948"/>
-            <w:vAlign w:val="center"/>
-            <w:shd w:val="clear" w:color="auto" w:fill="F8FAFF"/>
-          </w:tcPr>
-          <w:p>
-            <w:pPr>
-              <w:jc w:val="left"/>
-            </w:pPr>
-            <w:r>
-              <w:rPr>
-                <w:b w:val="0"/>
-                <w:i w:val="0"/>
-                <w:sz w:val="15"/>
-              </w:rPr>
-              <w:t>http://localhost:3002/maintain/queue/m001/offer</w:t>
-            </w:r>
-          </w:p>
-        </w:tc>
-      </w:tr>
-      <w:tr>
-        <w:trPr>
-          <w:trHeight w:val="340" w:hRule="atLeast"/>
-        </w:trPr>
-        <w:tc>
-          <w:tcPr>
-            <w:tcW w:type="dxa" w:w="1020"/>
-            <w:vAlign w:val="center"/>
-          </w:tcPr>
-          <w:p>
-            <w:pPr>
-              <w:jc w:val="left"/>
-            </w:pPr>
-            <w:r>
-              <w:rPr>
-                <w:b w:val="0"/>
-                <w:i w:val="0"/>
-                <w:sz w:val="15"/>
-              </w:rPr>
-              <w:t>R-12c</w:t>
-            </w:r>
-          </w:p>
-        </w:tc>
-        <w:tc>
-          <w:tcPr>
-            <w:tcW w:type="dxa" w:w="1814"/>
-            <w:vAlign w:val="center"/>
-          </w:tcPr>
-          <w:p>
-            <w:pPr>
-              <w:jc w:val="left"/>
-            </w:pPr>
-            <w:r>
-              <w:rPr>
-                <w:b w:val="0"/>
-                <w:i w:val="0"/>
-                <w:sz w:val="15"/>
-              </w:rPr>
-              <w:t>🆕 MAINTAIN-OFFER-SUCCESS</w:t>
-            </w:r>
-          </w:p>
-        </w:tc>
-        <w:tc>
-          <w:tcPr>
-            <w:tcW w:type="dxa" w:w="1361"/>
-            <w:vAlign w:val="center"/>
-          </w:tcPr>
-          <w:p>
-            <w:pPr>
-              <w:jc w:val="left"/>
-            </w:pPr>
-            <w:r>
-              <w:rPr>
-                <w:b w:val="0"/>
-                <w:i w:val="0"/>
-                <w:sz w:val="15"/>
-              </w:rPr>
-              <w:t>R-12b</w:t>
-            </w:r>
-          </w:p>
-        </w:tc>
-        <w:tc>
-          <w:tcPr>
-            <w:tcW w:type="dxa" w:w="1701"/>
-            <w:vAlign w:val="center"/>
-          </w:tcPr>
-          <w:p>
-            <w:pPr>
-              <w:jc w:val="left"/>
-            </w:pPr>
-            <w:r>
-              <w:rPr>
-                <w:b w:val="0"/>
-                <w:i w:val="0"/>
-                <w:sz w:val="15"/>
-              </w:rPr>
-              <w:t>M1: ยืนยันส่ง offer</w:t>
-            </w:r>
-          </w:p>
-        </w:tc>
-        <w:tc>
-          <w:tcPr>
-            <w:tcW w:type="dxa" w:w="1361"/>
-            <w:vAlign w:val="center"/>
-          </w:tcPr>
-          <w:p>
-            <w:pPr>
-              <w:jc w:val="left"/>
-            </w:pPr>
-            <w:r>
-              <w:rPr>
-                <w:b w:val="0"/>
-                <w:i w:val="0"/>
-                <w:sz w:val="15"/>
-              </w:rPr>
-              <w:t>R-12</w:t>
-            </w:r>
-          </w:p>
-        </w:tc>
-        <w:tc>
-          <w:tcPr>
-            <w:tcW w:type="dxa" w:w="1134"/>
-            <w:vAlign w:val="center"/>
-          </w:tcPr>
-          <w:p>
-            <w:pPr>
-              <w:jc w:val="left"/>
-            </w:pPr>
-            <w:r>
-              <w:rPr>
-                <w:b w:val="0"/>
-                <w:i w:val="0"/>
-                <w:sz w:val="15"/>
-              </w:rPr>
-              <w:t>WeeeR</w:t>
-            </w:r>
-          </w:p>
-        </w:tc>
-        <w:tc>
-          <w:tcPr>
-            <w:tcW w:type="dxa" w:w="850"/>
-            <w:vAlign w:val="center"/>
-          </w:tcPr>
-          <w:p>
-            <w:pPr>
-              <w:jc w:val="left"/>
-            </w:pPr>
-            <w:r>
-              <w:rPr>
-                <w:b w:val="0"/>
-                <w:i w:val="0"/>
-                <w:sz w:val="15"/>
-              </w:rPr>
-              <w:t>M1</w:t>
-            </w:r>
-          </w:p>
-        </w:tc>
-        <w:tc>
-          <w:tcPr>
-            <w:tcW w:type="dxa" w:w="1984"/>
-            <w:vAlign w:val="center"/>
-          </w:tcPr>
-          <w:p>
-            <w:pPr>
-              <w:jc w:val="left"/>
-            </w:pPr>
-            <w:r>
-              <w:rPr>
-                <w:b w:val="0"/>
-                <w:i w:val="0"/>
-                <w:sz w:val="15"/>
-              </w:rPr>
-              <w:t>ส่ง offer สำเร็จ</w:t>
-            </w:r>
-          </w:p>
-        </w:tc>
-        <w:tc>
-          <w:tcPr>
-            <w:tcW w:type="dxa" w:w="2948"/>
-            <w:vAlign w:val="center"/>
-          </w:tcPr>
-          <w:p>
-            <w:pPr>
-              <w:jc w:val="left"/>
-            </w:pPr>
-            <w:r>
-              <w:rPr>
-                <w:b w:val="0"/>
-                <w:i w:val="0"/>
-                <w:sz w:val="15"/>
-              </w:rPr>
-              <w:t>http://localhost:3002/maintain/queue/m001/offer/success</w:t>
             </w:r>
           </w:p>
         </w:tc>
@@ -14859,359 +14498,6 @@
                 <w:sz w:val="15"/>
               </w:rPr>
               <w:t>เคส</w:t>
-            </w:r>
-          </w:p>
-        </w:tc>
-        <w:tc>
-          <w:tcPr>
-            <w:tcW w:type="dxa" w:w="1134"/>
-            <w:vAlign w:val="center"/>
-          </w:tcPr>
-          <w:p>
-            <w:pPr>
-              <w:jc w:val="left"/>
-            </w:pPr>
-            <w:r>
-              <w:rPr>
-                <w:b w:val="0"/>
-                <w:i w:val="0"/>
-                <w:sz w:val="15"/>
-              </w:rPr>
-            </w:r>
-          </w:p>
-        </w:tc>
-        <w:tc>
-          <w:tcPr>
-            <w:tcW w:type="dxa" w:w="850"/>
-            <w:vAlign w:val="center"/>
-          </w:tcPr>
-          <w:p>
-            <w:pPr>
-              <w:jc w:val="left"/>
-            </w:pPr>
-            <w:r>
-              <w:rPr>
-                <w:b w:val="0"/>
-                <w:i w:val="0"/>
-                <w:sz w:val="15"/>
-              </w:rPr>
-            </w:r>
-          </w:p>
-        </w:tc>
-        <w:tc>
-          <w:tcPr>
-            <w:tcW w:type="dxa" w:w="1984"/>
-            <w:vAlign w:val="center"/>
-          </w:tcPr>
-          <w:p>
-            <w:pPr>
-              <w:jc w:val="left"/>
-            </w:pPr>
-            <w:r>
-              <w:rPr>
-                <w:b w:val="0"/>
-                <w:i w:val="0"/>
-                <w:sz w:val="15"/>
-              </w:rPr>
-            </w:r>
-          </w:p>
-        </w:tc>
-        <w:tc>
-          <w:tcPr>
-            <w:tcW w:type="dxa" w:w="2948"/>
-            <w:vAlign w:val="center"/>
-          </w:tcPr>
-          <w:p>
-            <w:pPr>
-              <w:jc w:val="left"/>
-            </w:pPr>
-            <w:r>
-              <w:rPr>
-                <w:b w:val="0"/>
-                <w:i w:val="0"/>
-                <w:sz w:val="15"/>
-              </w:rPr>
-            </w:r>
-          </w:p>
-        </w:tc>
-      </w:tr>
-      <w:tr>
-        <w:trPr>
-          <w:trHeight w:val="340" w:hRule="atLeast"/>
-        </w:trPr>
-        <w:tc>
-          <w:tcPr>
-            <w:tcW w:type="dxa" w:w="1020"/>
-            <w:vAlign w:val="center"/>
-            <w:shd w:val="clear" w:color="auto" w:fill="F8FAFF"/>
-          </w:tcPr>
-          <w:p>
-            <w:pPr>
-              <w:jc w:val="left"/>
-            </w:pPr>
-            <w:r>
-              <w:rPr>
-                <w:b w:val="0"/>
-                <w:i w:val="0"/>
-                <w:sz w:val="15"/>
-              </w:rPr>
-              <w:t>R-12b</w:t>
-            </w:r>
-          </w:p>
-        </w:tc>
-        <w:tc>
-          <w:tcPr>
-            <w:tcW w:type="dxa" w:w="1814"/>
-            <w:vAlign w:val="center"/>
-            <w:shd w:val="clear" w:color="auto" w:fill="F8FAFF"/>
-          </w:tcPr>
-          <w:p>
-            <w:pPr>
-              <w:jc w:val="left"/>
-            </w:pPr>
-            <w:r>
-              <w:rPr>
-                <w:b w:val="0"/>
-                <w:i w:val="0"/>
-                <w:sz w:val="15"/>
-              </w:rPr>
-              <w:t>MAINTAIN-QUEUE-OFFER</w:t>
-            </w:r>
-          </w:p>
-        </w:tc>
-        <w:tc>
-          <w:tcPr>
-            <w:tcW w:type="dxa" w:w="1361"/>
-            <w:vAlign w:val="center"/>
-            <w:shd w:val="clear" w:color="auto" w:fill="F8FAFF"/>
-          </w:tcPr>
-          <w:p>
-            <w:pPr>
-              <w:jc w:val="left"/>
-            </w:pPr>
-            <w:r>
-              <w:rPr>
-                <w:b w:val="0"/>
-                <w:i w:val="0"/>
-                <w:sz w:val="15"/>
-              </w:rPr>
-              <w:t>/maintain/queue/[id]/offer</w:t>
-            </w:r>
-          </w:p>
-        </w:tc>
-        <w:tc>
-          <w:tcPr>
-            <w:tcW w:type="dxa" w:w="1701"/>
-            <w:vAlign w:val="center"/>
-            <w:shd w:val="clear" w:color="auto" w:fill="F8FAFF"/>
-          </w:tcPr>
-          <w:p>
-            <w:pPr>
-              <w:jc w:val="left"/>
-            </w:pPr>
-            <w:r>
-              <w:rPr>
-                <w:b w:val="0"/>
-                <w:i w:val="0"/>
-                <w:sz w:val="15"/>
-              </w:rPr>
-              <w:t>WeeeR</w:t>
-            </w:r>
-          </w:p>
-        </w:tc>
-        <w:tc>
-          <w:tcPr>
-            <w:tcW w:type="dxa" w:w="1361"/>
-            <w:vAlign w:val="center"/>
-            <w:shd w:val="clear" w:color="auto" w:fill="F8FAFF"/>
-          </w:tcPr>
-          <w:p>
-            <w:pPr>
-              <w:jc w:val="left"/>
-            </w:pPr>
-            <w:r>
-              <w:rPr>
-                <w:b w:val="0"/>
-                <w:i w:val="0"/>
-                <w:sz w:val="15"/>
-              </w:rPr>
-              <w:t>M1</w:t>
-            </w:r>
-          </w:p>
-        </w:tc>
-        <w:tc>
-          <w:tcPr>
-            <w:tcW w:type="dxa" w:w="1134"/>
-            <w:vAlign w:val="center"/>
-            <w:shd w:val="clear" w:color="auto" w:fill="F8FAFF"/>
-          </w:tcPr>
-          <w:p>
-            <w:pPr>
-              <w:jc w:val="left"/>
-            </w:pPr>
-            <w:r>
-              <w:rPr>
-                <w:b w:val="0"/>
-                <w:i w:val="0"/>
-                <w:sz w:val="15"/>
-              </w:rPr>
-            </w:r>
-          </w:p>
-        </w:tc>
-        <w:tc>
-          <w:tcPr>
-            <w:tcW w:type="dxa" w:w="850"/>
-            <w:vAlign w:val="center"/>
-            <w:shd w:val="clear" w:color="auto" w:fill="F8FAFF"/>
-          </w:tcPr>
-          <w:p>
-            <w:pPr>
-              <w:jc w:val="left"/>
-            </w:pPr>
-            <w:r>
-              <w:rPr>
-                <w:b w:val="0"/>
-                <w:i w:val="0"/>
-                <w:sz w:val="15"/>
-              </w:rPr>
-            </w:r>
-          </w:p>
-        </w:tc>
-        <w:tc>
-          <w:tcPr>
-            <w:tcW w:type="dxa" w:w="1984"/>
-            <w:vAlign w:val="center"/>
-            <w:shd w:val="clear" w:color="auto" w:fill="F8FAFF"/>
-          </w:tcPr>
-          <w:p>
-            <w:pPr>
-              <w:jc w:val="left"/>
-            </w:pPr>
-            <w:r>
-              <w:rPr>
-                <w:b w:val="0"/>
-                <w:i w:val="0"/>
-                <w:sz w:val="15"/>
-              </w:rPr>
-            </w:r>
-          </w:p>
-        </w:tc>
-        <w:tc>
-          <w:tcPr>
-            <w:tcW w:type="dxa" w:w="2948"/>
-            <w:vAlign w:val="center"/>
-            <w:shd w:val="clear" w:color="auto" w:fill="F8FAFF"/>
-          </w:tcPr>
-          <w:p>
-            <w:pPr>
-              <w:jc w:val="left"/>
-            </w:pPr>
-            <w:r>
-              <w:rPr>
-                <w:b w:val="0"/>
-                <w:i w:val="0"/>
-                <w:sz w:val="15"/>
-              </w:rPr>
-            </w:r>
-          </w:p>
-        </w:tc>
-      </w:tr>
-      <w:tr>
-        <w:trPr>
-          <w:trHeight w:val="340" w:hRule="atLeast"/>
-        </w:trPr>
-        <w:tc>
-          <w:tcPr>
-            <w:tcW w:type="dxa" w:w="1020"/>
-            <w:vAlign w:val="center"/>
-          </w:tcPr>
-          <w:p>
-            <w:pPr>
-              <w:jc w:val="left"/>
-            </w:pPr>
-            <w:r>
-              <w:rPr>
-                <w:b w:val="0"/>
-                <w:i w:val="0"/>
-                <w:sz w:val="15"/>
-              </w:rPr>
-              <w:t>R-12c</w:t>
-            </w:r>
-          </w:p>
-        </w:tc>
-        <w:tc>
-          <w:tcPr>
-            <w:tcW w:type="dxa" w:w="1814"/>
-            <w:vAlign w:val="center"/>
-          </w:tcPr>
-          <w:p>
-            <w:pPr>
-              <w:jc w:val="left"/>
-            </w:pPr>
-            <w:r>
-              <w:rPr>
-                <w:b w:val="0"/>
-                <w:i w:val="0"/>
-                <w:sz w:val="15"/>
-              </w:rPr>
-              <w:t>MAINTAIN-OFFER-SUCCESS</w:t>
-            </w:r>
-          </w:p>
-        </w:tc>
-        <w:tc>
-          <w:tcPr>
-            <w:tcW w:type="dxa" w:w="1361"/>
-            <w:vAlign w:val="center"/>
-          </w:tcPr>
-          <w:p>
-            <w:pPr>
-              <w:jc w:val="left"/>
-            </w:pPr>
-            <w:r>
-              <w:rPr>
-                <w:b w:val="0"/>
-                <w:i w:val="0"/>
-                <w:sz w:val="15"/>
-              </w:rPr>
-              <w:t>/maintain/queue/[id]/offer/success</w:t>
-            </w:r>
-          </w:p>
-        </w:tc>
-        <w:tc>
-          <w:tcPr>
-            <w:tcW w:type="dxa" w:w="1701"/>
-            <w:vAlign w:val="center"/>
-          </w:tcPr>
-          <w:p>
-            <w:pPr>
-              <w:jc w:val="left"/>
-            </w:pPr>
-            <w:r>
-              <w:rPr>
-                <w:b w:val="0"/>
-                <w:i w:val="0"/>
-                <w:sz w:val="15"/>
-              </w:rPr>
-              <w:t>WeeeR</w:t>
-            </w:r>
-          </w:p>
-        </w:tc>
-        <w:tc>
-          <w:tcPr>
-            <w:tcW w:type="dxa" w:w="1361"/>
-            <w:vAlign w:val="center"/>
-          </w:tcPr>
-          <w:p>
-            <w:pPr>
-              <w:jc w:val="left"/>
-            </w:pPr>
-            <w:r>
-              <w:rPr>
-                <w:b w:val="0"/>
-                <w:i w:val="0"/>
-                <w:sz w:val="15"/>
-              </w:rPr>
-              <w:t>M1</w:t>
             </w:r>
           </w:p>
         </w:tc>

</xml_diff>

<commit_message>
docs(maintain): reforward — swap WeeeU↔WeeeR ports to canonical
Canonical port registry (package.json):
  WeeeU (weeeu) = 3002   WeeeR (weeer) = 3001
  WeeeT (weeet) = 3003   Admin = 3000   Website = 3004

DOCX on hub-integ-p2p3-v3 had ports inverted:
  U-* screens: 3001 → 3002 (25 cells)
  R-* screens: 3002 → 3001 (11 cells)
  T-*/A-*/W-* unchanged (already correct)

Verification: 66 URL cells checked → Errors: 0
Port counts: WeeeU=25×3002 · WeeeR=11×3001 · WeeeT=17×3003 · Admin=11×3004

Co-Authored-By: Claude Sonnet 4.6 <noreply@anthropic.com>
</commit_message>
<xml_diff>
--- a/docs/Maintain_Module.docx
+++ b/docs/Maintain_Module.docx
@@ -781,7 +781,7 @@
                 <w:i w:val="0"/>
                 <w:sz w:val="15"/>
               </w:rPr>
-              <w:t>http://localhost:3001/maintain/book</w:t>
+              <w:t>http://localhost:3002/maintain/book</w:t>
             </w:r>
           </w:p>
         </w:tc>
@@ -966,7 +966,7 @@
                 <w:i w:val="0"/>
                 <w:sz w:val="15"/>
               </w:rPr>
-              <w:t>http://localhost:3001/maintain/book/confirm</w:t>
+              <w:t>http://localhost:3002/maintain/book/confirm</w:t>
             </w:r>
           </w:p>
         </w:tc>
@@ -1142,7 +1142,7 @@
                 <w:i w:val="0"/>
                 <w:sz w:val="15"/>
               </w:rPr>
-              <w:t>http://localhost:3001/maintain/jobs</w:t>
+              <w:t>http://localhost:3002/maintain/jobs</w:t>
             </w:r>
           </w:p>
         </w:tc>
@@ -1327,7 +1327,7 @@
                 <w:i w:val="0"/>
                 <w:sz w:val="15"/>
               </w:rPr>
-              <w:t>http://localhost:3001/maintain/jobs/m001</w:t>
+              <w:t>http://localhost:3002/maintain/jobs/m001</w:t>
             </w:r>
           </w:p>
         </w:tc>
@@ -1503,7 +1503,7 @@
                 <w:i w:val="0"/>
                 <w:sz w:val="15"/>
               </w:rPr>
-              <w:t>http://localhost:3002/maintain/queue</w:t>
+              <w:t>http://localhost:3001/maintain/queue</w:t>
             </w:r>
           </w:p>
         </w:tc>
@@ -1688,7 +1688,7 @@
                 <w:i w:val="0"/>
                 <w:sz w:val="15"/>
               </w:rPr>
-              <w:t>http://localhost:3001/maintain/jobs/m001/offers</w:t>
+              <w:t>http://localhost:3002/maintain/jobs/m001/offers</w:t>
             </w:r>
           </w:p>
         </w:tc>
@@ -1864,7 +1864,7 @@
                 <w:i w:val="0"/>
                 <w:sz w:val="15"/>
               </w:rPr>
-              <w:t>http://localhost:3002/maintain/jobs/m001/assign</w:t>
+              <w:t>http://localhost:3001/maintain/jobs/m001/assign</w:t>
             </w:r>
           </w:p>
         </w:tc>
@@ -2049,7 +2049,7 @@
                 <w:i w:val="0"/>
                 <w:sz w:val="15"/>
               </w:rPr>
-              <w:t>http://localhost:3002/maintain/jobs/m001</w:t>
+              <w:t>http://localhost:3001/maintain/jobs/m001</w:t>
             </w:r>
           </w:p>
         </w:tc>
@@ -3505,7 +3505,7 @@
                 <w:i w:val="0"/>
                 <w:sz w:val="15"/>
               </w:rPr>
-              <w:t>http://localhost:3001/maintain/jobs/m001/rate</w:t>
+              <w:t>http://localhost:3002/maintain/jobs/m001/rate</w:t>
             </w:r>
           </w:p>
         </w:tc>
@@ -4265,7 +4265,7 @@
                 <w:i w:val="0"/>
                 <w:sz w:val="15"/>
               </w:rPr>
-              <w:t>http://localhost:3001/maintain/jobs/m001</w:t>
+              <w:t>http://localhost:3002/maintain/jobs/m001</w:t>
             </w:r>
           </w:p>
         </w:tc>
@@ -4450,7 +4450,7 @@
                 <w:i w:val="0"/>
                 <w:sz w:val="15"/>
               </w:rPr>
-              <w:t>http://localhost:3001/maintain/jobs/m001/mockup/m2-expired</w:t>
+              <w:t>http://localhost:3002/maintain/jobs/m001/mockup/m2-expired</w:t>
             </w:r>
           </w:p>
         </w:tc>
@@ -4626,7 +4626,7 @@
                 <w:i w:val="0"/>
                 <w:sz w:val="15"/>
               </w:rPr>
-              <w:t>http://localhost:3001/maintain/book?rebook=m001</w:t>
+              <w:t>http://localhost:3002/maintain/book?rebook=m001</w:t>
             </w:r>
           </w:p>
         </w:tc>
@@ -5571,7 +5571,7 @@
                 <w:i w:val="0"/>
                 <w:sz w:val="15"/>
               </w:rPr>
-              <w:t>http://localhost:3001/maintain/jobs/m001/mockup/m3-risk-inspect</w:t>
+              <w:t>http://localhost:3002/maintain/jobs/m001/mockup/m3-risk-inspect</w:t>
             </w:r>
           </w:p>
         </w:tc>
@@ -5756,7 +5756,7 @@
                 <w:i w:val="0"/>
                 <w:sz w:val="15"/>
               </w:rPr>
-              <w:t>http://localhost:3002/maintain/jobs/m001/mockup/m3-risk-notify</w:t>
+              <w:t>http://localhost:3001/maintain/jobs/m001/mockup/m3-risk-notify</w:t>
             </w:r>
           </w:p>
         </w:tc>
@@ -5932,7 +5932,7 @@
                 <w:i w:val="0"/>
                 <w:sz w:val="15"/>
               </w:rPr>
-              <w:t>http://localhost:3001/maintain/jobs/m001/cancel</w:t>
+              <w:t>http://localhost:3002/maintain/jobs/m001/cancel</w:t>
             </w:r>
           </w:p>
         </w:tc>
@@ -6877,7 +6877,7 @@
                 <w:i w:val="0"/>
                 <w:sz w:val="15"/>
               </w:rPr>
-              <w:t>http://localhost:3001/maintain/jobs/m001/extra-cost</w:t>
+              <w:t>http://localhost:3002/maintain/jobs/m001/extra-cost</w:t>
             </w:r>
           </w:p>
         </w:tc>
@@ -7062,7 +7062,7 @@
                 <w:i w:val="0"/>
                 <w:sz w:val="15"/>
               </w:rPr>
-              <w:t>http://localhost:3002/maintain/jobs/m001</w:t>
+              <w:t>http://localhost:3001/maintain/jobs/m001</w:t>
             </w:r>
           </w:p>
         </w:tc>
@@ -7998,7 +7998,7 @@
                 <w:i w:val="0"/>
                 <w:sz w:val="15"/>
               </w:rPr>
-              <w:t>http://localhost:3001/maintain/jobs/m001/mockup/m5-hybrid-a</w:t>
+              <w:t>http://localhost:3002/maintain/jobs/m001/mockup/m5-hybrid-a</w:t>
             </w:r>
           </w:p>
         </w:tc>
@@ -8183,7 +8183,7 @@
                 <w:i w:val="0"/>
                 <w:sz w:val="15"/>
               </w:rPr>
-              <w:t>http://localhost:3002/maintain/jobs/m001</w:t>
+              <w:t>http://localhost:3001/maintain/jobs/m001</w:t>
             </w:r>
           </w:p>
         </w:tc>
@@ -8369,7 +8369,7 @@
                 <w:i w:val="0"/>
                 <w:sz w:val="15"/>
               </w:rPr>
-              <w:t>http://localhost:3001/repair/new?from=maintain</w:t>
+              <w:t>http://localhost:3002/repair/new?from=maintain</w:t>
             </w:r>
           </w:p>
         </w:tc>
@@ -9138,7 +9138,7 @@
                 <w:i w:val="0"/>
                 <w:sz w:val="15"/>
               </w:rPr>
-              <w:t>http://localhost:3001/maintain/jobs/m001/extra-cost</w:t>
+              <w:t>http://localhost:3002/maintain/jobs/m001/extra-cost</w:t>
             </w:r>
           </w:p>
         </w:tc>
@@ -9716,7 +9716,7 @@
                 <w:i w:val="0"/>
                 <w:sz w:val="15"/>
               </w:rPr>
-              <w:t>http://localhost:3002/maintain/jobs/m001</w:t>
+              <w:t>http://localhost:3001/maintain/jobs/m001</w:t>
             </w:r>
           </w:p>
         </w:tc>
@@ -9901,7 +9901,7 @@
                 <w:i w:val="0"/>
                 <w:sz w:val="15"/>
               </w:rPr>
-              <w:t>http://localhost:3002/maintain/jobs/m001/mockup/m6-withdraw</w:t>
+              <w:t>http://localhost:3001/maintain/jobs/m001/mockup/m6-withdraw</w:t>
             </w:r>
           </w:p>
         </w:tc>
@@ -10077,7 +10077,7 @@
                 <w:i w:val="0"/>
                 <w:sz w:val="15"/>
               </w:rPr>
-              <w:t>http://localhost:3001/maintain/jobs/m001/mockup/m6-weeer-withdrew</w:t>
+              <w:t>http://localhost:3002/maintain/jobs/m001/mockup/m6-weeer-withdrew</w:t>
             </w:r>
           </w:p>
         </w:tc>
@@ -10262,7 +10262,7 @@
                 <w:i w:val="0"/>
                 <w:sz w:val="15"/>
               </w:rPr>
-              <w:t>http://localhost:3001/maintain/jobs/m001/cancel</w:t>
+              <w:t>http://localhost:3002/maintain/jobs/m001/cancel</w:t>
             </w:r>
           </w:p>
         </w:tc>
@@ -11201,7 +11201,7 @@
                 <w:i w:val="0"/>
                 <w:sz w:val="15"/>
               </w:rPr>
-              <w:t>http://localhost:3001/maintain/jobs/m001</w:t>
+              <w:t>http://localhost:3002/maintain/jobs/m001</w:t>
             </w:r>
           </w:p>
         </w:tc>
@@ -11386,7 +11386,7 @@
                 <w:i w:val="0"/>
                 <w:sz w:val="15"/>
               </w:rPr>
-              <w:t>http://localhost:3001/maintain/jobs/m001/reschedule</w:t>
+              <w:t>http://localhost:3002/maintain/jobs/m001/reschedule</w:t>
             </w:r>
           </w:p>
         </w:tc>
@@ -11562,7 +11562,7 @@
                 <w:i w:val="0"/>
                 <w:sz w:val="15"/>
               </w:rPr>
-              <w:t>http://localhost:3002/maintain/jobs/m001</w:t>
+              <w:t>http://localhost:3001/maintain/jobs/m001</w:t>
             </w:r>
           </w:p>
         </w:tc>
@@ -12146,7 +12146,7 @@
                 <w:i w:val="0"/>
                 <w:sz w:val="15"/>
               </w:rPr>
-              <w:t>http://localhost:3001/maintain/jobs/m001</w:t>
+              <w:t>http://localhost:3002/maintain/jobs/m001</w:t>
             </w:r>
           </w:p>
         </w:tc>
@@ -12331,7 +12331,7 @@
                 <w:i w:val="0"/>
                 <w:sz w:val="15"/>
               </w:rPr>
-              <w:t>http://localhost:3001/maintain/jobs/m001/cancel</w:t>
+              <w:t>http://localhost:3002/maintain/jobs/m001/cancel</w:t>
             </w:r>
           </w:p>
         </w:tc>
@@ -12507,7 +12507,7 @@
                 <w:i w:val="0"/>
                 <w:sz w:val="15"/>
               </w:rPr>
-              <w:t>http://localhost:3001/maintain/jobs/m001/reschedule</w:t>
+              <w:t>http://localhost:3002/maintain/jobs/m001/reschedule</w:t>
             </w:r>
           </w:p>
         </w:tc>
@@ -12692,7 +12692,7 @@
                 <w:i w:val="0"/>
                 <w:sz w:val="15"/>
               </w:rPr>
-              <w:t>http://localhost:3002/maintain/jobs/m001</w:t>
+              <w:t>http://localhost:3001/maintain/jobs/m001</w:t>
             </w:r>
           </w:p>
         </w:tc>
@@ -13267,7 +13267,7 @@
                 <w:i w:val="0"/>
                 <w:sz w:val="15"/>
               </w:rPr>
-              <w:t>http://localhost:3001/maintain/jobs/m001</w:t>
+              <w:t>http://localhost:3002/maintain/jobs/m001</w:t>
             </w:r>
           </w:p>
         </w:tc>
@@ -13452,7 +13452,7 @@
                 <w:i w:val="0"/>
                 <w:sz w:val="15"/>
               </w:rPr>
-              <w:t>http://localhost:3001/maintain/jobs/m001/mockup/m9-cancel-inprogress</w:t>
+              <w:t>http://localhost:3002/maintain/jobs/m001/mockup/m9-cancel-inprogress</w:t>
             </w:r>
           </w:p>
         </w:tc>
@@ -13628,7 +13628,7 @@
                 <w:i w:val="0"/>
                 <w:sz w:val="15"/>
               </w:rPr>
-              <w:t>http://localhost:3001/maintain/jobs/m001/cancel</w:t>
+              <w:t>http://localhost:3002/maintain/jobs/m001/cancel</w:t>
             </w:r>
           </w:p>
         </w:tc>
@@ -13813,7 +13813,7 @@
                 <w:i w:val="0"/>
                 <w:sz w:val="15"/>
               </w:rPr>
-              <w:t>http://localhost:3002/maintain/jobs/m001</w:t>
+              <w:t>http://localhost:3001/maintain/jobs/m001</w:t>
             </w:r>
           </w:p>
         </w:tc>

</xml_diff>